<commit_message>
docs(report): merge hull (Ⅱ) and circuit (Ⅳ) drafts from team into A/B report
Chapter Ⅱ comes from the hull team draft and Ⅳ from the circuit team
draft (10-31), ported into make_report_docx.js so A/B still build from
one generator. Photos and figures extracted to 보고서_분담/그림_팀원/.

Fixed while merging: scrambled sentences, 2025 hull type (catamaran +
keel, 4×T200), failsafe description (neutral, mode stays manual, 09-03),
e-stop test results from the 08-25/09-09 records, untested rows removed.
Team lead decisions: boat 2 beam 0.522 m, as-built thruster spacing,
boat 1 mass 30 kg, watertight test done on both. Review log in
팀원원고_검토_20261031.md.

Co-Authored-By: Claude Opus 5.5 <noreply@anthropic.com>
</commit_message>
<xml_diff>
--- a/docs/전달용/KABOAT2026_소프트웨어_SSF_A.docx
+++ b/docs/전달용/KABOAT2026_소프트웨어_SSF_A.docx
@@ -11653,7 +11653,7 @@
                 <w:sz w:val="20"/>
                 <w:szCs w:val="20"/>
               </w:rPr>
-              <w:t xml:space="preserve">1번배 폭 0.57 m → 0.285, 공용값 0.29</w:t>
+              <w:t xml:space="preserve">1번배 폭 0.55 m → 0.275, 공용값 0.29</w:t>
             </w:r>
           </w:p>
         </w:tc>
@@ -15316,7 +15316,7 @@
           <w:sz w:val="20"/>
           <w:szCs w:val="20"/>
         </w:rPr>
-        <w:t xml:space="preserve">half_width 0.29 에서 clearance 별 접촉은 0.20 → 1.95, 0.25 → 1.32, 0.30 → 1.46(정체 2%), 0.35 → 정체 28%, 0.45 → 정체 50% 로, 접촉이 가장 적은 0.45 는 절반이 정체라 고르지 않았다. 작년 값 half_width 0.45 는 1.15 m 갭을 요구해 접촉 3.0 회·정체 1.5 회였다(1차 단일 시드 스윕). 최적점의 갭 요구(half_width×2 + clearance)는 0.78~0.90 m 에 모인다. 한계도 있다. 접촉 판정이 반경 half_width 원이라 측면 접촉을 못 잡고, 동역학은 가정값이며, 시간 투표·지오펜스 병합은 시뮬에 없다. 선회 중 유효 폭 W·cosθ + L·sinθ 는 1번배 치수(W 0.58, L 1.66)로 10° 에서 0.86 m, 15° 에서 0.99 m 라 갭 요구 0.83 m 는 약 9° 이내로 정렬했을 때만 맞는다 — 1 m 안팎 틈은 시뮬이 못 잡는 영역이다.</w:t>
+        <w:t xml:space="preserve">half_width 0.29 에서 clearance 별 접촉은 0.20 → 1.95, 0.25 → 1.32, 0.30 → 1.46(정체 2%), 0.35 → 정체 28%, 0.45 → 정체 50% 로, 접촉이 가장 적은 0.45 는 절반이 정체라 고르지 않았다. 작년 값 half_width 0.45 는 1.15 m 갭을 요구해 접촉 3.0 회·정체 1.5 회였다(1차 단일 시드 스윕). 최적점의 갭 요구(half_width×2 + clearance)는 0.78~0.90 m 에 모인다. 한계도 있다. 접촉 판정이 반경 half_width 원이라 측면 접촉을 못 잡고, 동역학은 가정값이며, 시간 투표·지오펜스 병합은 시뮬에 없다. 선회 중 유효 폭 W·cosθ + L·sinθ 는 1번배 치수(W 0.55, L 1.66)로 10° 에서 0.83 m, 15° 에서 0.96 m 라 갭 요구 0.83 m 는 약 10° 이내로 정렬했을 때만 맞는다(10-31 실측 폭 0.55 로 재계산) — 1 m 안팎 틈은 시뮬이 못 잡는 영역이다.</w:t>
       </w:r>
     </w:p>
     <w:p>

</xml_diff>

<commit_message>
docs(report): apply merge fixes 1-5 — single-boat wording, hull and thruster figures
1. Ⅱ-1.2: drop scoring paragraph/table, keep course-object table.
2. Fig. Ⅱ-1 becomes (a) 3D hull render from the keel-less STL (boat 1)
   or design DXF (boat 2) via new tools/hull_render.py, plus (b)-(d)
   profile / half-breadth / body plan from the lines plans.
3. Fig. Ⅱ-2 redrawn with as-built thruster positions
   (thruster_asbuilt_A/B.png); the analysis figure is kept as is.
4. Each edition talks about its own boat only (intro, Ⅲ-1.1, tables,
   laptop model per boat, alignment angle per boat).
5. Boat B: tests measured on boat 1 hardware are labelled
   "same-spec parts" instead of being attributed to boat 2.

Requests logged in 보고서_분담/합본_수정요청.md.

Co-Authored-By: Claude Opus 5.5 <noreply@anthropic.com>
</commit_message>
<xml_diff>
--- a/docs/전달용/KABOAT2026_소프트웨어_SSF_A.docx
+++ b/docs/전달용/KABOAT2026_소프트웨어_SSF_A.docx
@@ -231,7 +231,7 @@
           <w:sz w:val="20"/>
           <w:szCs w:val="20"/>
         </w:rPr>
-        <w:t xml:space="preserve">선내 연산: Lenovo IdeaPad Slim 3 (Ubuntu 22.04, ROS2 Humble). 두 배가 각자 노트북·DDS 도메인을 가진다.</w:t>
+        <w:t xml:space="preserve">선내 연산: Lenovo IdeaPad Slim 3 15IAH8 (Ubuntu 22.04, ROS2 Humble). 노트북 1대가 본 선박의 ROS2 스택 전체를 돌리고, DDS 도메인을 따로 둔다.</w:t>
       </w:r>
     </w:p>
     <w:p>
@@ -319,7 +319,7 @@
           <w:sz w:val="20"/>
           <w:szCs w:val="20"/>
         </w:rPr>
-        <w:t xml:space="preserve">배 구분: 두 배는 같은 코드·같은 대회 launch 를 쓰고, 배마다 다른 값은 launch 인자 두 개로 고른다. </w:t>
+        <w:t xml:space="preserve">실행 인자: 본 선박은 </w:t>
       </w:r>
       <w:r>
         <w:rPr>
@@ -327,15 +327,15 @@
           <w:sz w:val="18"/>
           <w:szCs w:val="18"/>
         </w:rPr>
-        <w:t xml:space="preserve">boat:=A|B</w:t>
-      </w:r>
-      <w:r>
-        <w:rPr>
-          <w:rFonts w:ascii="Malgun Gothic" w:cs="Malgun Gothic" w:eastAsia="Malgun Gothic" w:hAnsi="Malgun Gothic"/>
-          <w:sz w:val="20"/>
-          <w:szCs w:val="20"/>
-        </w:rPr>
-        <w:t xml:space="preserve"> 는 기본값이 없는 필수 인자로 IMU 장착값 파일 </w:t>
+        <w:t xml:space="preserve">ros2 launch launch_files launch_files.launch.py boat:=A</w:t>
+      </w:r>
+      <w:r>
+        <w:rPr>
+          <w:rFonts w:ascii="Malgun Gothic" w:cs="Malgun Gothic" w:eastAsia="Malgun Gothic" w:hAnsi="Malgun Gothic"/>
+          <w:sz w:val="20"/>
+          <w:szCs w:val="20"/>
+        </w:rPr>
+        <w:t xml:space="preserve"> 로 띄운다. </w:t>
       </w:r>
       <w:r>
         <w:rPr>
@@ -343,15 +343,15 @@
           <w:sz w:val="18"/>
           <w:szCs w:val="18"/>
         </w:rPr>
-        <w:t xml:space="preserve">ssf_heading_&lt;boat&gt;.yaml</w:t>
-      </w:r>
-      <w:r>
-        <w:rPr>
-          <w:rFonts w:ascii="Malgun Gothic" w:cs="Malgun Gothic" w:eastAsia="Malgun Gothic" w:hAnsi="Malgun Gothic"/>
-          <w:sz w:val="20"/>
-          <w:szCs w:val="20"/>
-        </w:rPr>
-        <w:t xml:space="preserve"> 을 고르고, </w:t>
+        <w:t xml:space="preserve">boat</w:t>
+      </w:r>
+      <w:r>
+        <w:rPr>
+          <w:rFonts w:ascii="Malgun Gothic" w:cs="Malgun Gothic" w:eastAsia="Malgun Gothic" w:hAnsi="Malgun Gothic"/>
+          <w:sz w:val="20"/>
+          <w:szCs w:val="20"/>
+        </w:rPr>
+        <w:t xml:space="preserve"> 는 기본값이 없는 필수 인자로 IMU 장착값 파일 </w:t>
       </w:r>
       <w:r>
         <w:rPr>
@@ -359,15 +359,15 @@
           <w:sz w:val="18"/>
           <w:szCs w:val="18"/>
         </w:rPr>
-        <w:t xml:space="preserve">gps_config</w:t>
-      </w:r>
-      <w:r>
-        <w:rPr>
-          <w:rFonts w:ascii="Malgun Gothic" w:cs="Malgun Gothic" w:eastAsia="Malgun Gothic" w:hAnsi="Malgun Gothic"/>
-          <w:sz w:val="20"/>
-          <w:szCs w:val="20"/>
-        </w:rPr>
-        <w:t xml:space="preserve"> 는 수신기 설정 파일을 고른다. 1번배는 </w:t>
+        <w:t xml:space="preserve">ssf_heading_A.yaml</w:t>
+      </w:r>
+      <w:r>
+        <w:rPr>
+          <w:rFonts w:ascii="Malgun Gothic" w:cs="Malgun Gothic" w:eastAsia="Malgun Gothic" w:hAnsi="Malgun Gothic"/>
+          <w:sz w:val="20"/>
+          <w:szCs w:val="20"/>
+        </w:rPr>
+        <w:t xml:space="preserve"> 을 고르고, </w:t>
       </w:r>
       <w:r>
         <w:rPr>
@@ -375,15 +375,15 @@
           <w:sz w:val="18"/>
           <w:szCs w:val="18"/>
         </w:rPr>
-        <w:t xml:space="preserve">ros2 launch launch_files launch_files.launch.py boat:=A</w:t>
-      </w:r>
-      <w:r>
-        <w:rPr>
-          <w:rFonts w:ascii="Malgun Gothic" w:cs="Malgun Gothic" w:eastAsia="Malgun Gothic" w:hAnsi="Malgun Gothic"/>
-          <w:sz w:val="20"/>
-          <w:szCs w:val="20"/>
-        </w:rPr>
-        <w:t xml:space="preserve"> 로 띄우고, 수신기 설정은 zed_f9p_rover.yaml(기본값) 이다. </w:t>
+        <w:t xml:space="preserve">gps_config</w:t>
+      </w:r>
+      <w:r>
+        <w:rPr>
+          <w:rFonts w:ascii="Malgun Gothic" w:cs="Malgun Gothic" w:eastAsia="Malgun Gothic" w:hAnsi="Malgun Gothic"/>
+          <w:sz w:val="20"/>
+          <w:szCs w:val="20"/>
+        </w:rPr>
+        <w:t xml:space="preserve"> 는 수신기 설정 파일을 고르며 본 선박은 zed_f9p_rover.yaml(기본값) 이다. </w:t>
       </w:r>
       <w:r>
         <w:rPr>
@@ -391,54 +391,6 @@
           <w:sz w:val="18"/>
           <w:szCs w:val="18"/>
         </w:rPr>
-        <w:t xml:space="preserve">gps_config</w:t>
-      </w:r>
-      <w:r>
-        <w:rPr>
-          <w:rFonts w:ascii="Malgun Gothic" w:cs="Malgun Gothic" w:eastAsia="Malgun Gothic" w:hAnsi="Malgun Gothic"/>
-          <w:sz w:val="20"/>
-          <w:szCs w:val="20"/>
-        </w:rPr>
-        <w:t xml:space="preserve"> 기본값은 </w:t>
-      </w:r>
-      <w:r>
-        <w:rPr>
-          <w:rFonts w:ascii="Consolas" w:cs="Consolas" w:eastAsia="Consolas" w:hAnsi="Consolas"/>
-          <w:sz w:val="18"/>
-          <w:szCs w:val="18"/>
-        </w:rPr>
-        <w:t xml:space="preserve">zed_f9p_rover.yaml</w:t>
-      </w:r>
-      <w:r>
-        <w:rPr>
-          <w:rFonts w:ascii="Malgun Gothic" w:cs="Malgun Gothic" w:eastAsia="Malgun Gothic" w:hAnsi="Malgun Gothic"/>
-          <w:sz w:val="20"/>
-          <w:szCs w:val="20"/>
-        </w:rPr>
-        <w:t xml:space="preserve"> 이고 C94-M8P 를 다는 배는 </w:t>
-      </w:r>
-      <w:r>
-        <w:rPr>
-          <w:rFonts w:ascii="Consolas" w:cs="Consolas" w:eastAsia="Consolas" w:hAnsi="Consolas"/>
-          <w:sz w:val="18"/>
-          <w:szCs w:val="18"/>
-        </w:rPr>
-        <w:t xml:space="preserve">gps_config:=c94_m8p_rover.yaml</w:t>
-      </w:r>
-      <w:r>
-        <w:rPr>
-          <w:rFonts w:ascii="Malgun Gothic" w:cs="Malgun Gothic" w:eastAsia="Malgun Gothic" w:hAnsi="Malgun Gothic"/>
-          <w:sz w:val="20"/>
-          <w:szCs w:val="20"/>
-        </w:rPr>
-        <w:t xml:space="preserve"> 을 붙인다. </w:t>
-      </w:r>
-      <w:r>
-        <w:rPr>
-          <w:rFonts w:ascii="Consolas" w:cs="Consolas" w:eastAsia="Consolas" w:hAnsi="Consolas"/>
-          <w:sz w:val="18"/>
-          <w:szCs w:val="18"/>
-        </w:rPr>
         <w:t xml:space="preserve">boat</w:t>
       </w:r>
       <w:r>
@@ -447,7 +399,7 @@
           <w:sz w:val="20"/>
           <w:szCs w:val="20"/>
         </w:rPr>
-        <w:t xml:space="preserve"> 가 빠지거나 A/B 가 아니면 launch 가 거부되고, 배별 파일이 없으면 어떤 노드도 띄우기 전에 launch 전체를 세운다.</w:t>
+        <w:t xml:space="preserve"> 가 빠지거나 잘못되면 launch 가 거부되고, 장착값 파일이 없으면 어떤 노드도 띄우기 전에 launch 전체를 세운다.</w:t>
       </w:r>
     </w:p>
     <w:p>
@@ -1707,7 +1659,7 @@
                 <w:sz w:val="20"/>
                 <w:szCs w:val="20"/>
               </w:rPr>
-              <w:t xml:space="preserve">장애물·부표 거리, 갭 탐색, 감속 신호, 지오펜스 병합, 센서 감시. Sensitivity 모드, 25 m. 회전수·각분해능이 개체마다 달라 셀 수에 기대는 값은 배별로 다르게 동작한다</w:t>
+              <w:t xml:space="preserve">장애물·부표 거리, 갭 탐색, 감속 신호, 지오펜스 병합, 센서 감시. Sensitivity 모드, 25 m. 회전수·각분해능이 개체마다 달라 셀 수에 기대는 값은 개체에 따라 다르게 동작한다</w:t>
             </w:r>
           </w:p>
         </w:tc>
@@ -1966,7 +1918,7 @@
                 <w:sz w:val="20"/>
                 <w:szCs w:val="20"/>
               </w:rPr>
-              <w:t xml:space="preserve"> 마스트 꼭대기에서 부표·도크 표식의 색·형상 방위각을 낸다. 배당 1대. PoE 인젝터 도착 전까지는 D455 가 임시로 같은 검출기 입력을 맡고, 교체하는 날 </w:t>
+              <w:t xml:space="preserve"> 마스트 꼭대기에서 부표·도크 표식의 색·형상 방위각을 낸다. 1대 탑재. PoE 인젝터 도착 전까지는 D455 가 임시로 같은 검출기 입력을 맡고, 교체하는 날 </w:t>
             </w:r>
             <w:r>
               <w:rPr>
@@ -1998,7 +1950,7 @@
                 <w:sz w:val="20"/>
                 <w:szCs w:val="20"/>
               </w:rPr>
-              <w:t xml:space="preserve">(camera_info 실측)만 바꾼다. 10-31 1번배에서 연결·화각·각도를 실측했다(Ⅲ-6.2)</w:t>
+              <w:t xml:space="preserve">(camera_info 실측)만 바꾼다. 10-31 1번배 기준으로 연결·화각·각도를 실측했다(Ⅲ-6.2)</w:t>
             </w:r>
           </w:p>
         </w:tc>
@@ -2897,15 +2849,15 @@
           <w:sz w:val="20"/>
           <w:szCs w:val="20"/>
         </w:rPr>
-        <w:t xml:space="preserve">배별 장착값.</w:t>
-      </w:r>
-      <w:r>
-        <w:rPr>
-          <w:rFonts w:ascii="Malgun Gothic" w:cs="Malgun Gothic" w:eastAsia="Malgun Gothic" w:hAnsi="Malgun Gothic"/>
-          <w:sz w:val="20"/>
-          <w:szCs w:val="20"/>
-        </w:rPr>
-        <w:t xml:space="preserve"> 배마다 다른 값은 </w:t>
+        <w:t xml:space="preserve">본 선박 장착값.</w:t>
+      </w:r>
+      <w:r>
+        <w:rPr>
+          <w:rFonts w:ascii="Malgun Gothic" w:cs="Malgun Gothic" w:eastAsia="Malgun Gothic" w:hAnsi="Malgun Gothic"/>
+          <w:sz w:val="20"/>
+          <w:szCs w:val="20"/>
+        </w:rPr>
+        <w:t xml:space="preserve"> 선박 고유 값은 </w:t>
       </w:r>
       <w:r>
         <w:rPr>
@@ -2953,7 +2905,7 @@
           <w:sz w:val="20"/>
           <w:szCs w:val="20"/>
         </w:rPr>
-        <w:t xml:space="preserve"> 에 둔다. launch 는 공통 → 배별 순서로 넘겨 뒤 파일 값이 이기고, 벤치 실행도 같은 </w:t>
+        <w:t xml:space="preserve"> 에 둔다. launch 는 공통 → 선박 파일 순서로 넘겨 뒤 파일 값이 이기고, 벤치 실행도 같은 </w:t>
       </w:r>
       <w:r>
         <w:rPr>
@@ -2969,7 +2921,7 @@
           <w:sz w:val="20"/>
           <w:szCs w:val="20"/>
         </w:rPr>
-        <w:t xml:space="preserve"> 인자를 요구한다. 배별 파일에 두 키 외의 값(안전 스위치 등)이 들어가거나 </w:t>
+        <w:t xml:space="preserve"> 인자를 요구한다. 선박 파일에 두 키 외의 값(안전 스위치 등)이 들어가거나 </w:t>
       </w:r>
       <w:r>
         <w:rPr>
@@ -3339,7 +3291,7 @@
                 <w:sz w:val="20"/>
                 <w:szCs w:val="20"/>
               </w:rPr>
-              <w:t xml:space="preserve"> (배별)</w:t>
+              <w:t xml:space="preserve"> (선박 고유)</w:t>
             </w:r>
           </w:p>
         </w:tc>
@@ -3387,14 +3339,6 @@
             </w:tcMar>
           </w:tcPr>
           <w:p>
-            <w:r>
-              <w:rPr>
-                <w:rFonts w:ascii="Malgun Gothic" w:cs="Malgun Gothic" w:eastAsia="Malgun Gothic" w:hAnsi="Malgun Gothic"/>
-                <w:sz w:val="20"/>
-                <w:szCs w:val="20"/>
-              </w:rPr>
-              <w:t xml:space="preserve">배별 파일 </w:t>
-            </w:r>
             <w:r>
               <w:rPr>
                 <w:rFonts w:ascii="Consolas" w:cs="Consolas" w:eastAsia="Consolas" w:hAnsi="Consolas"/>
@@ -4647,7 +4591,7 @@
           <w:sz w:val="20"/>
           <w:szCs w:val="20"/>
         </w:rPr>
-        <w:t xml:space="preserve"> 는 수신기 드라이버보다 2.0 s 늦게 뜨고, 계정은 저장소 밖(~/.ssf/) 파일에서 읽는다. 파일이 없으면 예외 없이 그 노드만 생략한다 — 예외가 나면 메인 launch 전체가 내려가기 때문이다. 세션이 끊기면 5 s 간격 최대 10회 재연결한다. 외부 드라이버는 설정만 바꿨다: 두 배 해상 모델 </w:t>
+        <w:t xml:space="preserve"> 는 수신기 드라이버보다 2.0 s 늦게 뜨고, 계정은 저장소 밖(~/.ssf/) 파일에서 읽는다. 파일이 없으면 예외 없이 그 노드만 생략한다 — 예외가 나면 메인 launch 전체가 내려가기 때문이다. 세션이 끊기면 5 s 간격 최대 10회 재연결한다. 외부 드라이버는 설정만 바꿨다: 해상 모델 </w:t>
       </w:r>
       <w:r>
         <w:rPr>
@@ -11985,7 +11929,7 @@
                 <w:sz w:val="20"/>
                 <w:szCs w:val="20"/>
               </w:rPr>
-              <w:t xml:space="preserve">3 이면 작은 부표를 무시한다 (두 배 공용)</w:t>
+              <w:t xml:space="preserve">3 이면 작은 부표를 무시한다</w:t>
             </w:r>
           </w:p>
         </w:tc>
@@ -15316,7 +15260,7 @@
           <w:sz w:val="20"/>
           <w:szCs w:val="20"/>
         </w:rPr>
-        <w:t xml:space="preserve">half_width 0.29 에서 clearance 별 접촉은 0.20 → 1.95, 0.25 → 1.32, 0.30 → 1.46(정체 2%), 0.35 → 정체 28%, 0.45 → 정체 50% 로, 접촉이 가장 적은 0.45 는 절반이 정체라 고르지 않았다. 작년 값 half_width 0.45 는 1.15 m 갭을 요구해 접촉 3.0 회·정체 1.5 회였다(1차 단일 시드 스윕). 최적점의 갭 요구(half_width×2 + clearance)는 0.78~0.90 m 에 모인다. 한계도 있다. 접촉 판정이 반경 half_width 원이라 측면 접촉을 못 잡고, 동역학은 가정값이며, 시간 투표·지오펜스 병합은 시뮬에 없다. 선회 중 유효 폭 W·cosθ + L·sinθ 는 1번배 치수(W 0.55, L 1.66)로 10° 에서 0.83 m, 15° 에서 0.96 m 라 갭 요구 0.83 m 는 약 10° 이내로 정렬했을 때만 맞는다(10-31 실측 폭 0.55 로 재계산) — 1 m 안팎 틈은 시뮬이 못 잡는 영역이다.</w:t>
+        <w:t xml:space="preserve">half_width 0.29 에서 clearance 별 접촉은 0.20 → 1.95, 0.25 → 1.32, 0.30 → 1.46(정체 2%), 0.35 → 정체 28%, 0.45 → 정체 50% 로, 접촉이 가장 적은 0.45 는 절반이 정체라 고르지 않았다. 작년 값 half_width 0.45 는 1.15 m 갭을 요구해 접촉 3.0 회·정체 1.5 회였다(1차 단일 시드 스윕). 최적점의 갭 요구(half_width×2 + clearance)는 0.78~0.90 m 에 모인다. 한계도 있다. 접촉 판정이 반경 half_width 원이라 측면 접촉을 못 잡고, 동역학은 가정값이며, 시간 투표·지오펜스 병합은 시뮬에 없다. 선회 중 유효 폭 W·cosθ + L·sinθ 는 1번배 치수(W 0.55, L 1.66)로 10° 에서 0.83 m, 15° 에서 0.96 m 라 갭 요구 0.83 m 는 약 10° 이내로 정렬했을 때만 맞는다(실측 폭으로 재계산) — 1 m 안팎 틈은 시뮬이 못 잡는 영역이다.</w:t>
       </w:r>
     </w:p>
     <w:p>
@@ -16522,7 +16466,7 @@
                 <w:sz w:val="20"/>
                 <w:szCs w:val="20"/>
               </w:rPr>
-              <w:t xml:space="preserve">Main Computer — 배당 1대, ROS2 Humble (두 배 각 1대)</w:t>
+              <w:t xml:space="preserve">Main Computer — ROS2 Humble</w:t>
             </w:r>
           </w:p>
         </w:tc>
@@ -16605,7 +16549,7 @@
                 <w:sz w:val="20"/>
                 <w:szCs w:val="20"/>
               </w:rPr>
-              <w:t xml:space="preserve">RC 수신·ESC 2채널·LED·비상정지 감지 (ssf_boat.ino, 두 배 동일 펌웨어)</w:t>
+              <w:t xml:space="preserve">RC 수신·ESC 2채널·LED·비상정지 감지 (ssf_boat.ino)</w:t>
             </w:r>
           </w:p>
         </w:tc>

</xml_diff>